<commit_message>
Add save success notification to planning calendar notes
Co-Authored-By: Claude Sonnet 4.6 <noreply@anthropic.com>
</commit_message>
<xml_diff>
--- a/PARS End User Documentation.docx
+++ b/PARS End User Documentation.docx
@@ -174,7 +174,7 @@
         </w:rPr>
         <w:t> </w:t>
       </w:r>
-      <w:hyperlink r:id="rId7" w:tooltip="https://apps.crtct.org:8056/" w:history="1">
+      <w:hyperlink r:id="rId8" w:tooltip="https://apps.crtct.org:8056/" w:history="1">
         <w:r>
           <w:rPr>
             <w:rStyle w:val="Hyperlink"/>
@@ -197,14 +197,7 @@
           <w:sz w:val="28"/>
           <w:szCs w:val="28"/>
         </w:rPr>
-        <w:t> </w:t>
-      </w:r>
-      <w:r>
-        <w:rPr>
-          <w:sz w:val="28"/>
-          <w:szCs w:val="28"/>
-        </w:rPr>
-        <w:t xml:space="preserve">If you </w:t>
+        <w:t xml:space="preserve"> If you </w:t>
       </w:r>
       <w:proofErr w:type="gramStart"/>
       <w:r>
@@ -224,6 +217,7 @@
       </w:r>
       <w:r>
         <w:rPr>
+          <w:noProof/>
           <w:sz w:val="28"/>
           <w:szCs w:val="28"/>
         </w:rPr>
@@ -245,7 +239,7 @@
                     </pic:cNvPicPr>
                   </pic:nvPicPr>
                   <pic:blipFill>
-                    <a:blip r:embed="rId8" cstate="print">
+                    <a:blip r:embed="rId9" cstate="print">
                       <a:extLst>
                         <a:ext uri="{28A0092B-C50C-407E-A947-70E740481C1C}">
                           <a14:useLocalDpi xmlns:a14="http://schemas.microsoft.com/office/drawing/2010/main" val="0"/>
@@ -332,6 +326,7 @@
       </w:pPr>
       <w:r>
         <w:rPr>
+          <w:noProof/>
           <w:sz w:val="28"/>
           <w:szCs w:val="28"/>
         </w:rPr>
@@ -353,7 +348,7 @@
                     </pic:cNvPicPr>
                   </pic:nvPicPr>
                   <pic:blipFill>
-                    <a:blip r:embed="rId9" cstate="print">
+                    <a:blip r:embed="rId10" cstate="print">
                       <a:extLst>
                         <a:ext uri="{28A0092B-C50C-407E-A947-70E740481C1C}">
                           <a14:useLocalDpi xmlns:a14="http://schemas.microsoft.com/office/drawing/2010/main" val="0"/>
@@ -394,6 +389,7 @@
       </w:pPr>
       <w:r>
         <w:rPr>
+          <w:noProof/>
           <w:sz w:val="28"/>
           <w:szCs w:val="28"/>
         </w:rPr>
@@ -415,7 +411,7 @@
                     </pic:cNvPicPr>
                   </pic:nvPicPr>
                   <pic:blipFill>
-                    <a:blip r:embed="rId10" cstate="print">
+                    <a:blip r:embed="rId11" cstate="print">
                       <a:extLst>
                         <a:ext uri="{28A0092B-C50C-407E-A947-70E740481C1C}">
                           <a14:useLocalDpi xmlns:a14="http://schemas.microsoft.com/office/drawing/2010/main" val="0"/>
@@ -596,14 +592,7 @@
           <w:sz w:val="28"/>
           <w:szCs w:val="28"/>
         </w:rPr>
-        <w:t xml:space="preserve">   • </w:t>
-      </w:r>
-      <w:r>
-        <w:rPr>
-          <w:sz w:val="28"/>
-          <w:szCs w:val="28"/>
-        </w:rPr>
-        <w:t xml:space="preserve">If the amount of total allocated hours for a single day does not match the </w:t>
+        <w:t xml:space="preserve">   • If the amount of total allocated hours for a single day does not match the </w:t>
       </w:r>
       <w:r>
         <w:rPr>
@@ -651,6 +640,7 @@
       </w:pPr>
       <w:r>
         <w:rPr>
+          <w:noProof/>
           <w:sz w:val="28"/>
           <w:szCs w:val="28"/>
         </w:rPr>
@@ -672,7 +662,7 @@
                     </pic:cNvPicPr>
                   </pic:nvPicPr>
                   <pic:blipFill>
-                    <a:blip r:embed="rId11" cstate="print">
+                    <a:blip r:embed="rId12" cstate="print">
                       <a:extLst>
                         <a:ext uri="{28A0092B-C50C-407E-A947-70E740481C1C}">
                           <a14:useLocalDpi xmlns:a14="http://schemas.microsoft.com/office/drawing/2010/main" val="0"/>
@@ -759,6 +749,7 @@
       </w:pPr>
       <w:r>
         <w:rPr>
+          <w:noProof/>
           <w:sz w:val="28"/>
           <w:szCs w:val="28"/>
         </w:rPr>
@@ -781,7 +772,7 @@
                     </pic:cNvPicPr>
                   </pic:nvPicPr>
                   <pic:blipFill>
-                    <a:blip r:embed="rId12" cstate="print">
+                    <a:blip r:embed="rId13" cstate="print">
                       <a:extLst>
                         <a:ext uri="{28A0092B-C50C-407E-A947-70E740481C1C}">
                           <a14:useLocalDpi xmlns:a14="http://schemas.microsoft.com/office/drawing/2010/main" val="0"/>
@@ -988,6 +979,7 @@
       </w:pPr>
       <w:r>
         <w:rPr>
+          <w:noProof/>
           <w:sz w:val="28"/>
           <w:szCs w:val="28"/>
         </w:rPr>
@@ -1009,7 +1001,7 @@
                     </pic:cNvPicPr>
                   </pic:nvPicPr>
                   <pic:blipFill>
-                    <a:blip r:embed="rId13" cstate="print">
+                    <a:blip r:embed="rId14" cstate="print">
                       <a:extLst>
                         <a:ext uri="{28A0092B-C50C-407E-A947-70E740481C1C}">
                           <a14:useLocalDpi xmlns:a14="http://schemas.microsoft.com/office/drawing/2010/main" val="0"/>
@@ -1061,7 +1053,14 @@
           <w:sz w:val="28"/>
           <w:szCs w:val="28"/>
         </w:rPr>
-        <w:t xml:space="preserve">Once you have completed your allocations for a given pay </w:t>
+        <w:t xml:space="preserve">Once you have completed your allocations for a given pay period </w:t>
+      </w:r>
+      <w:r>
+        <w:rPr>
+          <w:sz w:val="28"/>
+          <w:szCs w:val="28"/>
+        </w:rPr>
+        <w:t xml:space="preserve">an </w:t>
       </w:r>
       <w:proofErr w:type="gramStart"/>
       <w:r>
@@ -1069,7 +1068,14 @@
           <w:sz w:val="28"/>
           <w:szCs w:val="28"/>
         </w:rPr>
-        <w:t>period</w:t>
+        <w:t xml:space="preserve">automated </w:t>
+      </w:r>
+      <w:r>
+        <w:rPr>
+          <w:sz w:val="28"/>
+          <w:szCs w:val="28"/>
+        </w:rPr>
+        <w:t xml:space="preserve"> email</w:t>
       </w:r>
       <w:proofErr w:type="gramEnd"/>
       <w:r>
@@ -1077,88 +1083,733 @@
           <w:sz w:val="28"/>
           <w:szCs w:val="28"/>
         </w:rPr>
-        <w:t xml:space="preserve"> please email your manager that the pay period has been allocated for! </w:t>
-      </w:r>
-    </w:p>
-    <w:p>
-      <w:pPr>
-        <w:rPr>
-          <w:sz w:val="28"/>
-          <w:szCs w:val="28"/>
-        </w:rPr>
-      </w:pPr>
-      <w:r>
-        <w:rPr>
-          <w:sz w:val="28"/>
-          <w:szCs w:val="28"/>
-        </w:rPr>
-        <w:t> </w:t>
-      </w:r>
-    </w:p>
-    <w:p>
-      <w:pPr>
-        <w:rPr>
-          <w:sz w:val="28"/>
-          <w:szCs w:val="28"/>
-        </w:rPr>
-      </w:pPr>
-      <w:r>
-        <w:rPr>
-          <w:sz w:val="28"/>
-          <w:szCs w:val="28"/>
-        </w:rPr>
-        <w:t> </w:t>
-      </w:r>
-    </w:p>
-    <w:p>
-      <w:pPr>
+        <w:t xml:space="preserve"> </w:t>
+      </w:r>
+      <w:r>
+        <w:rPr>
+          <w:sz w:val="28"/>
+          <w:szCs w:val="28"/>
+        </w:rPr>
+        <w:t xml:space="preserve">will be sent to </w:t>
+      </w:r>
+      <w:r>
+        <w:rPr>
+          <w:sz w:val="28"/>
+          <w:szCs w:val="28"/>
+        </w:rPr>
+        <w:t xml:space="preserve">your manager that the pay period has been allocated for! </w:t>
+      </w:r>
+    </w:p>
+    <w:p>
+      <w:pPr>
+        <w:rPr>
+          <w:sz w:val="28"/>
+          <w:szCs w:val="28"/>
+        </w:rPr>
+      </w:pPr>
+    </w:p>
+    <w:p>
+      <w:pPr>
+        <w:rPr>
+          <w:sz w:val="28"/>
+          <w:szCs w:val="28"/>
+        </w:rPr>
+      </w:pPr>
+      <w:r>
+        <w:rPr>
+          <w:sz w:val="28"/>
+          <w:szCs w:val="28"/>
+        </w:rPr>
+        <w:t xml:space="preserve">Part 5. </w:t>
+      </w:r>
+      <w:r>
+        <w:rPr>
+          <w:sz w:val="28"/>
+          <w:szCs w:val="28"/>
+        </w:rPr>
+        <w:t>Extra Features</w:t>
+      </w:r>
+    </w:p>
+    <w:p>
+      <w:pPr>
+        <w:rPr>
+          <w:sz w:val="28"/>
+          <w:szCs w:val="28"/>
+        </w:rPr>
+      </w:pPr>
+      <w:r>
+        <w:rPr>
+          <w:noProof/>
+          <w:sz w:val="28"/>
+          <w:szCs w:val="28"/>
+        </w:rPr>
+        <w:drawing>
+          <wp:inline distT="0" distB="0" distL="0" distR="0" wp14:anchorId="5729DB49" wp14:editId="12C0848A">
+            <wp:extent cx="3543300" cy="2209800"/>
+            <wp:effectExtent l="0" t="0" r="0" b="0"/>
+            <wp:docPr id="39002851" name="Picture 1"/>
+            <wp:cNvGraphicFramePr>
+              <a:graphicFrameLocks xmlns:a="http://schemas.openxmlformats.org/drawingml/2006/main" noChangeAspect="1"/>
+            </wp:cNvGraphicFramePr>
+            <a:graphic xmlns:a="http://schemas.openxmlformats.org/drawingml/2006/main">
+              <a:graphicData uri="http://schemas.openxmlformats.org/drawingml/2006/picture">
+                <pic:pic xmlns:pic="http://schemas.openxmlformats.org/drawingml/2006/picture">
+                  <pic:nvPicPr>
+                    <pic:cNvPr id="0" name="Picture 1"/>
+                    <pic:cNvPicPr>
+                      <a:picLocks noChangeAspect="1" noChangeArrowheads="1"/>
+                    </pic:cNvPicPr>
+                  </pic:nvPicPr>
+                  <pic:blipFill>
+                    <a:blip r:embed="rId15">
+                      <a:extLst>
+                        <a:ext uri="{28A0092B-C50C-407E-A947-70E740481C1C}">
+                          <a14:useLocalDpi xmlns:a14="http://schemas.microsoft.com/office/drawing/2010/main" val="0"/>
+                        </a:ext>
+                      </a:extLst>
+                    </a:blip>
+                    <a:srcRect/>
+                    <a:stretch>
+                      <a:fillRect/>
+                    </a:stretch>
+                  </pic:blipFill>
+                  <pic:spPr bwMode="auto">
+                    <a:xfrm>
+                      <a:off x="0" y="0"/>
+                      <a:ext cx="3543300" cy="2209800"/>
+                    </a:xfrm>
+                    <a:prstGeom prst="rect">
+                      <a:avLst/>
+                    </a:prstGeom>
+                    <a:noFill/>
+                    <a:ln>
+                      <a:noFill/>
+                    </a:ln>
+                  </pic:spPr>
+                </pic:pic>
+              </a:graphicData>
+            </a:graphic>
+          </wp:inline>
+        </w:drawing>
+      </w:r>
+    </w:p>
+    <w:p>
+      <w:pPr>
+        <w:rPr>
+          <w:sz w:val="28"/>
+          <w:szCs w:val="28"/>
+        </w:rPr>
+      </w:pPr>
+      <w:r>
+        <w:rPr>
+          <w:sz w:val="28"/>
+          <w:szCs w:val="28"/>
+        </w:rPr>
+        <w:lastRenderedPageBreak/>
+        <w:t xml:space="preserve">Included in the new </w:t>
+      </w:r>
+      <w:proofErr w:type="gramStart"/>
+      <w:r>
+        <w:rPr>
+          <w:sz w:val="28"/>
+          <w:szCs w:val="28"/>
+        </w:rPr>
+        <w:t>pars</w:t>
+      </w:r>
+      <w:proofErr w:type="gramEnd"/>
+      <w:r>
+        <w:rPr>
+          <w:sz w:val="28"/>
+          <w:szCs w:val="28"/>
+        </w:rPr>
+        <w:t xml:space="preserve"> is a way to plan your future allocations to make time tracking easy with the Planning Calendar. To use simply open the calendar, select a date, and insert the Task, Fund, and Time associated with that record just as you would when inserting for your </w:t>
+      </w:r>
+      <w:proofErr w:type="gramStart"/>
+      <w:r>
+        <w:rPr>
+          <w:sz w:val="28"/>
+          <w:szCs w:val="28"/>
+        </w:rPr>
+        <w:t>time card</w:t>
+      </w:r>
+      <w:proofErr w:type="gramEnd"/>
+      <w:r>
+        <w:rPr>
+          <w:sz w:val="28"/>
+          <w:szCs w:val="28"/>
+        </w:rPr>
+        <w:t>. This lets you save the records for future dates when the pay period is not yet accessible in PARS.</w:t>
+      </w:r>
+    </w:p>
+    <w:p>
+      <w:pPr>
+        <w:rPr>
+          <w:sz w:val="28"/>
+          <w:szCs w:val="28"/>
+        </w:rPr>
+      </w:pPr>
+      <w:r>
+        <w:rPr>
+          <w:noProof/>
+          <w:sz w:val="28"/>
+          <w:szCs w:val="28"/>
+        </w:rPr>
+        <w:drawing>
+          <wp:inline distT="0" distB="0" distL="0" distR="0" wp14:anchorId="64FD98B1" wp14:editId="7D06B9F1">
+            <wp:extent cx="2895600" cy="5095875"/>
+            <wp:effectExtent l="0" t="0" r="0" b="9525"/>
+            <wp:docPr id="1527609552" name="Picture 2"/>
+            <wp:cNvGraphicFramePr>
+              <a:graphicFrameLocks xmlns:a="http://schemas.openxmlformats.org/drawingml/2006/main" noChangeAspect="1"/>
+            </wp:cNvGraphicFramePr>
+            <a:graphic xmlns:a="http://schemas.openxmlformats.org/drawingml/2006/main">
+              <a:graphicData uri="http://schemas.openxmlformats.org/drawingml/2006/picture">
+                <pic:pic xmlns:pic="http://schemas.openxmlformats.org/drawingml/2006/picture">
+                  <pic:nvPicPr>
+                    <pic:cNvPr id="0" name="Picture 2"/>
+                    <pic:cNvPicPr>
+                      <a:picLocks noChangeAspect="1" noChangeArrowheads="1"/>
+                    </pic:cNvPicPr>
+                  </pic:nvPicPr>
+                  <pic:blipFill>
+                    <a:blip r:embed="rId16">
+                      <a:extLst>
+                        <a:ext uri="{28A0092B-C50C-407E-A947-70E740481C1C}">
+                          <a14:useLocalDpi xmlns:a14="http://schemas.microsoft.com/office/drawing/2010/main" val="0"/>
+                        </a:ext>
+                      </a:extLst>
+                    </a:blip>
+                    <a:srcRect/>
+                    <a:stretch>
+                      <a:fillRect/>
+                    </a:stretch>
+                  </pic:blipFill>
+                  <pic:spPr bwMode="auto">
+                    <a:xfrm>
+                      <a:off x="0" y="0"/>
+                      <a:ext cx="2895600" cy="5095875"/>
+                    </a:xfrm>
+                    <a:prstGeom prst="rect">
+                      <a:avLst/>
+                    </a:prstGeom>
+                    <a:noFill/>
+                    <a:ln>
+                      <a:noFill/>
+                    </a:ln>
+                  </pic:spPr>
+                </pic:pic>
+              </a:graphicData>
+            </a:graphic>
+          </wp:inline>
+        </w:drawing>
+      </w:r>
+    </w:p>
+    <w:p>
+      <w:pPr>
+        <w:pStyle w:val="ListParagraph"/>
+        <w:numPr>
+          <w:ilvl w:val="0"/>
+          <w:numId w:val="1"/>
+        </w:numPr>
+        <w:rPr>
+          <w:sz w:val="28"/>
+          <w:szCs w:val="28"/>
+        </w:rPr>
+      </w:pPr>
+      <w:r>
+        <w:rPr>
+          <w:sz w:val="28"/>
+          <w:szCs w:val="28"/>
+        </w:rPr>
+        <w:t xml:space="preserve">Dark Blue – Days </w:t>
+      </w:r>
+      <w:proofErr w:type="gramStart"/>
+      <w:r>
+        <w:rPr>
+          <w:sz w:val="28"/>
+          <w:szCs w:val="28"/>
+        </w:rPr>
+        <w:t>With</w:t>
+      </w:r>
+      <w:proofErr w:type="gramEnd"/>
+      <w:r>
+        <w:rPr>
+          <w:sz w:val="28"/>
+          <w:szCs w:val="28"/>
+        </w:rPr>
+        <w:t xml:space="preserve"> Notes</w:t>
+      </w:r>
+    </w:p>
+    <w:p>
+      <w:pPr>
+        <w:pStyle w:val="ListParagraph"/>
+        <w:numPr>
+          <w:ilvl w:val="0"/>
+          <w:numId w:val="1"/>
+        </w:numPr>
+        <w:rPr>
+          <w:sz w:val="28"/>
+          <w:szCs w:val="28"/>
+        </w:rPr>
+      </w:pPr>
+      <w:r>
+        <w:rPr>
+          <w:sz w:val="28"/>
+          <w:szCs w:val="28"/>
+        </w:rPr>
+        <w:t>Light Blue – Selected Day</w:t>
+      </w:r>
+    </w:p>
+    <w:p>
+      <w:pPr>
+        <w:pStyle w:val="ListParagraph"/>
+        <w:numPr>
+          <w:ilvl w:val="0"/>
+          <w:numId w:val="1"/>
+        </w:numPr>
+        <w:rPr>
+          <w:sz w:val="28"/>
+          <w:szCs w:val="28"/>
+        </w:rPr>
+      </w:pPr>
+      <w:r>
+        <w:rPr>
+          <w:sz w:val="28"/>
+          <w:szCs w:val="28"/>
+        </w:rPr>
+        <w:t>Yellow – Current Day</w:t>
+      </w:r>
+    </w:p>
+    <w:p>
+      <w:pPr>
+        <w:ind w:left="360"/>
+        <w:rPr>
+          <w:sz w:val="28"/>
+          <w:szCs w:val="28"/>
+        </w:rPr>
+      </w:pPr>
+      <w:r>
+        <w:rPr>
+          <w:noProof/>
+          <w:sz w:val="28"/>
+          <w:szCs w:val="28"/>
+        </w:rPr>
+        <w:lastRenderedPageBreak/>
+        <w:drawing>
+          <wp:inline distT="0" distB="0" distL="0" distR="0" wp14:anchorId="413B0785" wp14:editId="100DE1D1">
+            <wp:extent cx="2828925" cy="5391150"/>
+            <wp:effectExtent l="0" t="0" r="9525" b="0"/>
+            <wp:docPr id="1155546697" name="Picture 3"/>
+            <wp:cNvGraphicFramePr>
+              <a:graphicFrameLocks xmlns:a="http://schemas.openxmlformats.org/drawingml/2006/main" noChangeAspect="1"/>
+            </wp:cNvGraphicFramePr>
+            <a:graphic xmlns:a="http://schemas.openxmlformats.org/drawingml/2006/main">
+              <a:graphicData uri="http://schemas.openxmlformats.org/drawingml/2006/picture">
+                <pic:pic xmlns:pic="http://schemas.openxmlformats.org/drawingml/2006/picture">
+                  <pic:nvPicPr>
+                    <pic:cNvPr id="0" name="Picture 3"/>
+                    <pic:cNvPicPr>
+                      <a:picLocks noChangeAspect="1" noChangeArrowheads="1"/>
+                    </pic:cNvPicPr>
+                  </pic:nvPicPr>
+                  <pic:blipFill>
+                    <a:blip r:embed="rId17">
+                      <a:extLst>
+                        <a:ext uri="{28A0092B-C50C-407E-A947-70E740481C1C}">
+                          <a14:useLocalDpi xmlns:a14="http://schemas.microsoft.com/office/drawing/2010/main" val="0"/>
+                        </a:ext>
+                      </a:extLst>
+                    </a:blip>
+                    <a:srcRect/>
+                    <a:stretch>
+                      <a:fillRect/>
+                    </a:stretch>
+                  </pic:blipFill>
+                  <pic:spPr bwMode="auto">
+                    <a:xfrm>
+                      <a:off x="0" y="0"/>
+                      <a:ext cx="2828925" cy="5391150"/>
+                    </a:xfrm>
+                    <a:prstGeom prst="rect">
+                      <a:avLst/>
+                    </a:prstGeom>
+                    <a:noFill/>
+                    <a:ln>
+                      <a:noFill/>
+                    </a:ln>
+                  </pic:spPr>
+                </pic:pic>
+              </a:graphicData>
+            </a:graphic>
+          </wp:inline>
+        </w:drawing>
+      </w:r>
+    </w:p>
+    <w:p>
+      <w:pPr>
+        <w:ind w:left="360"/>
+        <w:rPr>
+          <w:sz w:val="28"/>
+          <w:szCs w:val="28"/>
+        </w:rPr>
+      </w:pPr>
+      <w:r>
+        <w:rPr>
+          <w:sz w:val="28"/>
+          <w:szCs w:val="28"/>
+        </w:rPr>
+        <w:t xml:space="preserve">Once you have entered in your note for that day, simply hit save and then you can access it in the future. </w:t>
+      </w:r>
+    </w:p>
+    <w:p>
+      <w:pPr>
+        <w:ind w:left="360"/>
+        <w:rPr>
+          <w:sz w:val="28"/>
+          <w:szCs w:val="28"/>
+        </w:rPr>
+      </w:pPr>
+    </w:p>
+    <w:p>
+      <w:pPr>
+        <w:ind w:left="360"/>
+        <w:rPr>
+          <w:sz w:val="28"/>
+          <w:szCs w:val="28"/>
+        </w:rPr>
+      </w:pPr>
+    </w:p>
+    <w:p>
+      <w:pPr>
+        <w:ind w:left="360"/>
+        <w:rPr>
+          <w:sz w:val="28"/>
+          <w:szCs w:val="28"/>
+        </w:rPr>
+      </w:pPr>
+    </w:p>
+    <w:p>
+      <w:pPr>
+        <w:ind w:left="360"/>
+        <w:rPr>
+          <w:sz w:val="28"/>
+          <w:szCs w:val="28"/>
+        </w:rPr>
+      </w:pPr>
+    </w:p>
+    <w:p>
+      <w:pPr>
+        <w:ind w:left="360"/>
+        <w:rPr>
+          <w:sz w:val="28"/>
+          <w:szCs w:val="28"/>
+        </w:rPr>
+      </w:pPr>
+    </w:p>
+    <w:p>
+      <w:pPr>
+        <w:ind w:left="360"/>
+        <w:rPr>
+          <w:sz w:val="28"/>
+          <w:szCs w:val="28"/>
+        </w:rPr>
+      </w:pPr>
+    </w:p>
+    <w:p>
+      <w:pPr>
+        <w:ind w:left="360"/>
+        <w:rPr>
+          <w:sz w:val="28"/>
+          <w:szCs w:val="28"/>
+        </w:rPr>
+      </w:pPr>
+      <w:r>
+        <w:rPr>
+          <w:sz w:val="28"/>
+          <w:szCs w:val="28"/>
+        </w:rPr>
+        <w:lastRenderedPageBreak/>
+        <w:t xml:space="preserve">Another feature is the automatic allocation button. On days where you have not yet submitted tasks, funds, and hours you can use the </w:t>
+      </w:r>
+      <w:r>
         <w:rPr>
           <w:b/>
           <w:bCs/>
           <w:sz w:val="28"/>
           <w:szCs w:val="28"/>
         </w:rPr>
-      </w:pPr>
-    </w:p>
-    <w:p>
-      <w:pPr>
+        <w:t>Auto Allocate</w:t>
+      </w:r>
+      <w:r>
         <w:rPr>
           <w:b/>
           <w:bCs/>
           <w:sz w:val="28"/>
           <w:szCs w:val="28"/>
         </w:rPr>
-      </w:pPr>
-    </w:p>
-    <w:p>
-      <w:pPr>
+        <w:t xml:space="preserve"> </w:t>
+      </w:r>
+      <w:r>
+        <w:rPr>
+          <w:sz w:val="28"/>
+          <w:szCs w:val="28"/>
+        </w:rPr>
+        <w:t xml:space="preserve">button to automatically set the hours and funds to the exact percentages based on the funds associated to you. </w:t>
+      </w:r>
+    </w:p>
+    <w:p>
+      <w:pPr>
+        <w:ind w:left="360"/>
+        <w:rPr>
+          <w:sz w:val="28"/>
+          <w:szCs w:val="28"/>
+        </w:rPr>
+      </w:pPr>
+      <w:r>
+        <w:rPr>
+          <w:sz w:val="28"/>
+          <w:szCs w:val="28"/>
+        </w:rPr>
+        <w:t xml:space="preserve">You can see those percentages by hovering over the </w:t>
+      </w:r>
+      <w:r>
         <w:rPr>
           <w:b/>
           <w:bCs/>
           <w:sz w:val="28"/>
           <w:szCs w:val="28"/>
         </w:rPr>
-      </w:pPr>
-    </w:p>
-    <w:p>
-      <w:pPr>
+        <w:t>Information</w:t>
+      </w:r>
+      <w:r>
+        <w:rPr>
+          <w:sz w:val="28"/>
+          <w:szCs w:val="28"/>
+        </w:rPr>
+        <w:t xml:space="preserve"> icon underneath </w:t>
+      </w:r>
+      <w:r>
         <w:rPr>
           <w:b/>
           <w:bCs/>
           <w:sz w:val="28"/>
           <w:szCs w:val="28"/>
         </w:rPr>
-      </w:pPr>
-    </w:p>
-    <w:p>
-      <w:pPr>
+        <w:t>Fund Code Breakdown</w:t>
+      </w:r>
+      <w:r>
         <w:rPr>
           <w:b/>
           <w:bCs/>
           <w:sz w:val="28"/>
           <w:szCs w:val="28"/>
         </w:rPr>
-      </w:pPr>
+        <w:t xml:space="preserve">. </w:t>
+      </w:r>
+      <w:r>
+        <w:rPr>
+          <w:sz w:val="28"/>
+          <w:szCs w:val="28"/>
+        </w:rPr>
+        <w:t xml:space="preserve">If you choose to auto allocate funds, the task will be set to Other Hours. </w:t>
+      </w:r>
+    </w:p>
+    <w:p>
+      <w:pPr>
+        <w:ind w:left="360"/>
+        <w:rPr>
+          <w:sz w:val="28"/>
+          <w:szCs w:val="28"/>
+        </w:rPr>
+      </w:pPr>
+      <w:r>
+        <w:rPr>
+          <w:sz w:val="28"/>
+          <w:szCs w:val="28"/>
+        </w:rPr>
+        <w:t xml:space="preserve">You will have to set the task to whatever activity you </w:t>
+      </w:r>
+      <w:proofErr w:type="gramStart"/>
+      <w:r>
+        <w:rPr>
+          <w:sz w:val="28"/>
+          <w:szCs w:val="28"/>
+        </w:rPr>
+        <w:t>completed</w:t>
+      </w:r>
+      <w:proofErr w:type="gramEnd"/>
+      <w:r>
+        <w:rPr>
+          <w:sz w:val="28"/>
+          <w:szCs w:val="28"/>
+        </w:rPr>
+        <w:t xml:space="preserve">, but everything else will be set </w:t>
+      </w:r>
+      <w:proofErr w:type="gramStart"/>
+      <w:r>
+        <w:rPr>
+          <w:sz w:val="28"/>
+          <w:szCs w:val="28"/>
+        </w:rPr>
+        <w:t>in regards to</w:t>
+      </w:r>
+      <w:proofErr w:type="gramEnd"/>
+      <w:r>
+        <w:rPr>
+          <w:sz w:val="28"/>
+          <w:szCs w:val="28"/>
+        </w:rPr>
+        <w:t xml:space="preserve"> your allocation percentages. Once completed simply hit save just as you would saving any other timecard record.</w:t>
+      </w:r>
+    </w:p>
+    <w:p>
+      <w:pPr>
+        <w:ind w:left="360"/>
+        <w:rPr>
+          <w:sz w:val="28"/>
+          <w:szCs w:val="28"/>
+        </w:rPr>
+      </w:pPr>
+      <w:r>
+        <w:rPr>
+          <w:noProof/>
+          <w:sz w:val="28"/>
+          <w:szCs w:val="28"/>
+        </w:rPr>
+        <w:drawing>
+          <wp:inline distT="0" distB="0" distL="0" distR="0" wp14:anchorId="3618C5AC" wp14:editId="767674A7">
+            <wp:extent cx="5934075" cy="1438275"/>
+            <wp:effectExtent l="0" t="0" r="9525" b="9525"/>
+            <wp:docPr id="350933005" name="Picture 6"/>
+            <wp:cNvGraphicFramePr>
+              <a:graphicFrameLocks xmlns:a="http://schemas.openxmlformats.org/drawingml/2006/main" noChangeAspect="1"/>
+            </wp:cNvGraphicFramePr>
+            <a:graphic xmlns:a="http://schemas.openxmlformats.org/drawingml/2006/main">
+              <a:graphicData uri="http://schemas.openxmlformats.org/drawingml/2006/picture">
+                <pic:pic xmlns:pic="http://schemas.openxmlformats.org/drawingml/2006/picture">
+                  <pic:nvPicPr>
+                    <pic:cNvPr id="0" name="Picture 6"/>
+                    <pic:cNvPicPr>
+                      <a:picLocks noChangeAspect="1" noChangeArrowheads="1"/>
+                    </pic:cNvPicPr>
+                  </pic:nvPicPr>
+                  <pic:blipFill>
+                    <a:blip r:embed="rId18" cstate="print">
+                      <a:extLst>
+                        <a:ext uri="{28A0092B-C50C-407E-A947-70E740481C1C}">
+                          <a14:useLocalDpi xmlns:a14="http://schemas.microsoft.com/office/drawing/2010/main" val="0"/>
+                        </a:ext>
+                      </a:extLst>
+                    </a:blip>
+                    <a:srcRect/>
+                    <a:stretch>
+                      <a:fillRect/>
+                    </a:stretch>
+                  </pic:blipFill>
+                  <pic:spPr bwMode="auto">
+                    <a:xfrm>
+                      <a:off x="0" y="0"/>
+                      <a:ext cx="5934075" cy="1438275"/>
+                    </a:xfrm>
+                    <a:prstGeom prst="rect">
+                      <a:avLst/>
+                    </a:prstGeom>
+                    <a:noFill/>
+                    <a:ln>
+                      <a:noFill/>
+                    </a:ln>
+                  </pic:spPr>
+                </pic:pic>
+              </a:graphicData>
+            </a:graphic>
+          </wp:inline>
+        </w:drawing>
+      </w:r>
+      <w:r>
+        <w:rPr>
+          <w:noProof/>
+          <w:sz w:val="28"/>
+          <w:szCs w:val="28"/>
+        </w:rPr>
+        <w:drawing>
+          <wp:inline distT="0" distB="0" distL="0" distR="0" wp14:anchorId="3EFE5BF8" wp14:editId="2E365C0F">
+            <wp:extent cx="5934075" cy="1971675"/>
+            <wp:effectExtent l="0" t="0" r="9525" b="9525"/>
+            <wp:docPr id="1076306897" name="Picture 4"/>
+            <wp:cNvGraphicFramePr>
+              <a:graphicFrameLocks xmlns:a="http://schemas.openxmlformats.org/drawingml/2006/main" noChangeAspect="1"/>
+            </wp:cNvGraphicFramePr>
+            <a:graphic xmlns:a="http://schemas.openxmlformats.org/drawingml/2006/main">
+              <a:graphicData uri="http://schemas.openxmlformats.org/drawingml/2006/picture">
+                <pic:pic xmlns:pic="http://schemas.openxmlformats.org/drawingml/2006/picture">
+                  <pic:nvPicPr>
+                    <pic:cNvPr id="0" name="Picture 4"/>
+                    <pic:cNvPicPr>
+                      <a:picLocks noChangeAspect="1" noChangeArrowheads="1"/>
+                    </pic:cNvPicPr>
+                  </pic:nvPicPr>
+                  <pic:blipFill>
+                    <a:blip r:embed="rId19" cstate="print">
+                      <a:extLst>
+                        <a:ext uri="{28A0092B-C50C-407E-A947-70E740481C1C}">
+                          <a14:useLocalDpi xmlns:a14="http://schemas.microsoft.com/office/drawing/2010/main" val="0"/>
+                        </a:ext>
+                      </a:extLst>
+                    </a:blip>
+                    <a:srcRect/>
+                    <a:stretch>
+                      <a:fillRect/>
+                    </a:stretch>
+                  </pic:blipFill>
+                  <pic:spPr bwMode="auto">
+                    <a:xfrm>
+                      <a:off x="0" y="0"/>
+                      <a:ext cx="5934075" cy="1971675"/>
+                    </a:xfrm>
+                    <a:prstGeom prst="rect">
+                      <a:avLst/>
+                    </a:prstGeom>
+                    <a:noFill/>
+                    <a:ln>
+                      <a:noFill/>
+                    </a:ln>
+                  </pic:spPr>
+                </pic:pic>
+              </a:graphicData>
+            </a:graphic>
+          </wp:inline>
+        </w:drawing>
+      </w:r>
+    </w:p>
+    <w:p>
+      <w:pPr>
+        <w:rPr>
+          <w:sz w:val="28"/>
+          <w:szCs w:val="28"/>
+        </w:rPr>
+      </w:pPr>
+      <w:r>
+        <w:rPr>
+          <w:sz w:val="28"/>
+          <w:szCs w:val="28"/>
+        </w:rPr>
+        <w:t> </w:t>
+      </w:r>
+    </w:p>
+    <w:p>
+      <w:pPr>
+        <w:rPr>
+          <w:sz w:val="28"/>
+          <w:szCs w:val="28"/>
+        </w:rPr>
+      </w:pPr>
+      <w:r>
+        <w:rPr>
+          <w:sz w:val="28"/>
+          <w:szCs w:val="28"/>
+        </w:rPr>
+        <w:t> </w:t>
+      </w:r>
     </w:p>
     <w:p>
       <w:pPr>
@@ -1183,160 +1834,209 @@
     <w:p>
       <w:pPr>
         <w:rPr>
-          <w:sz w:val="28"/>
-          <w:szCs w:val="28"/>
-        </w:rPr>
-      </w:pPr>
-      <w:r>
-        <w:rPr>
           <w:b/>
           <w:bCs/>
           <w:sz w:val="28"/>
           <w:szCs w:val="28"/>
         </w:rPr>
-        <w:lastRenderedPageBreak/>
-        <w:t>MANAGERS ONLY ACCESS</w:t>
-      </w:r>
-    </w:p>
-    <w:p>
-      <w:pPr>
-        <w:rPr>
-          <w:sz w:val="28"/>
-          <w:szCs w:val="28"/>
-        </w:rPr>
-      </w:pPr>
-      <w:r>
-        <w:rPr>
-          <w:sz w:val="28"/>
-          <w:szCs w:val="28"/>
-        </w:rPr>
-        <w:t xml:space="preserve">Part </w:t>
-      </w:r>
-      <w:r>
-        <w:rPr>
-          <w:sz w:val="28"/>
-          <w:szCs w:val="28"/>
-        </w:rPr>
-        <w:t xml:space="preserve">5. Manager Approval </w:t>
-      </w:r>
-      <w:proofErr w:type="gramStart"/>
-      <w:r>
-        <w:rPr>
-          <w:sz w:val="28"/>
-          <w:szCs w:val="28"/>
-        </w:rPr>
-        <w:t>Of</w:t>
-      </w:r>
-      <w:proofErr w:type="gramEnd"/>
-      <w:r>
-        <w:rPr>
-          <w:sz w:val="28"/>
-          <w:szCs w:val="28"/>
-        </w:rPr>
-        <w:t xml:space="preserve"> Timecard </w:t>
-      </w:r>
-    </w:p>
-    <w:p>
-      <w:pPr>
-        <w:rPr>
-          <w:sz w:val="28"/>
-          <w:szCs w:val="28"/>
-        </w:rPr>
-      </w:pPr>
-      <w:r>
-        <w:rPr>
-          <w:sz w:val="28"/>
-          <w:szCs w:val="28"/>
-        </w:rPr>
-        <w:t xml:space="preserve">For managers you have access to view each of the employees in your </w:t>
-      </w:r>
-      <w:proofErr w:type="gramStart"/>
-      <w:r>
-        <w:rPr>
-          <w:sz w:val="28"/>
-          <w:szCs w:val="28"/>
-        </w:rPr>
-        <w:t>departments</w:t>
-      </w:r>
-      <w:proofErr w:type="gramEnd"/>
-      <w:r>
-        <w:rPr>
-          <w:sz w:val="28"/>
-          <w:szCs w:val="28"/>
-        </w:rPr>
-        <w:t xml:space="preserve"> </w:t>
-      </w:r>
-      <w:proofErr w:type="gramStart"/>
-      <w:r>
-        <w:rPr>
-          <w:sz w:val="28"/>
-          <w:szCs w:val="28"/>
-        </w:rPr>
-        <w:t>time cards</w:t>
-      </w:r>
-      <w:proofErr w:type="gramEnd"/>
-      <w:r>
-        <w:rPr>
-          <w:sz w:val="28"/>
-          <w:szCs w:val="28"/>
-        </w:rPr>
-        <w:t xml:space="preserve">. After and employee submits and </w:t>
-      </w:r>
-      <w:proofErr w:type="gramStart"/>
-      <w:r>
-        <w:rPr>
-          <w:sz w:val="28"/>
-          <w:szCs w:val="28"/>
-        </w:rPr>
-        <w:t>Acknowledges</w:t>
-      </w:r>
-      <w:proofErr w:type="gramEnd"/>
-      <w:r>
-        <w:rPr>
-          <w:sz w:val="28"/>
-          <w:szCs w:val="28"/>
-        </w:rPr>
-        <w:t xml:space="preserve"> their </w:t>
-      </w:r>
-      <w:proofErr w:type="gramStart"/>
-      <w:r>
-        <w:rPr>
-          <w:sz w:val="28"/>
-          <w:szCs w:val="28"/>
-        </w:rPr>
-        <w:t>time cards</w:t>
-      </w:r>
-      <w:proofErr w:type="gramEnd"/>
-      <w:r>
-        <w:rPr>
-          <w:sz w:val="28"/>
-          <w:szCs w:val="28"/>
-        </w:rPr>
-        <w:t xml:space="preserve"> you will then review the </w:t>
-      </w:r>
-      <w:proofErr w:type="gramStart"/>
-      <w:r>
-        <w:rPr>
-          <w:sz w:val="28"/>
-          <w:szCs w:val="28"/>
-        </w:rPr>
-        <w:t>time card</w:t>
-      </w:r>
-      <w:proofErr w:type="gramEnd"/>
-      <w:r>
-        <w:rPr>
-          <w:sz w:val="28"/>
-          <w:szCs w:val="28"/>
-        </w:rPr>
-        <w:t xml:space="preserve"> and Approve It by checking off the box next to </w:t>
-      </w:r>
-      <w:r>
+      </w:pPr>
+    </w:p>
+    <w:p>
+      <w:pPr>
         <w:rPr>
           <w:b/>
           <w:bCs/>
           <w:sz w:val="28"/>
           <w:szCs w:val="28"/>
         </w:rPr>
+      </w:pPr>
+    </w:p>
+    <w:p>
+      <w:pPr>
+        <w:rPr>
+          <w:b/>
+          <w:bCs/>
+          <w:sz w:val="28"/>
+          <w:szCs w:val="28"/>
+        </w:rPr>
+      </w:pPr>
+    </w:p>
+    <w:p>
+      <w:pPr>
+        <w:rPr>
+          <w:b/>
+          <w:bCs/>
+          <w:sz w:val="28"/>
+          <w:szCs w:val="28"/>
+        </w:rPr>
+      </w:pPr>
+    </w:p>
+    <w:p>
+      <w:pPr>
+        <w:rPr>
+          <w:b/>
+          <w:bCs/>
+          <w:sz w:val="28"/>
+          <w:szCs w:val="28"/>
+        </w:rPr>
+      </w:pPr>
+    </w:p>
+    <w:p>
+      <w:pPr>
+        <w:rPr>
+          <w:sz w:val="28"/>
+          <w:szCs w:val="28"/>
+        </w:rPr>
+      </w:pPr>
+      <w:r>
+        <w:rPr>
+          <w:b/>
+          <w:bCs/>
+          <w:sz w:val="28"/>
+          <w:szCs w:val="28"/>
+        </w:rPr>
+        <w:t>MANAGERS ONLY ACCESS</w:t>
+      </w:r>
+    </w:p>
+    <w:p>
+      <w:pPr>
+        <w:rPr>
+          <w:sz w:val="28"/>
+          <w:szCs w:val="28"/>
+        </w:rPr>
+      </w:pPr>
+      <w:r>
+        <w:rPr>
+          <w:sz w:val="28"/>
+          <w:szCs w:val="28"/>
+        </w:rPr>
+        <w:t xml:space="preserve">Part </w:t>
+      </w:r>
+      <w:r>
+        <w:rPr>
+          <w:sz w:val="28"/>
+          <w:szCs w:val="28"/>
+        </w:rPr>
+        <w:t xml:space="preserve">5. Manager Approval </w:t>
+      </w:r>
+      <w:proofErr w:type="gramStart"/>
+      <w:r>
+        <w:rPr>
+          <w:sz w:val="28"/>
+          <w:szCs w:val="28"/>
+        </w:rPr>
+        <w:t>Of</w:t>
+      </w:r>
+      <w:proofErr w:type="gramEnd"/>
+      <w:r>
+        <w:rPr>
+          <w:sz w:val="28"/>
+          <w:szCs w:val="28"/>
+        </w:rPr>
+        <w:t xml:space="preserve"> Timecard </w:t>
+      </w:r>
+    </w:p>
+    <w:p>
+      <w:pPr>
+        <w:rPr>
+          <w:sz w:val="28"/>
+          <w:szCs w:val="28"/>
+        </w:rPr>
+      </w:pPr>
+      <w:r>
+        <w:rPr>
+          <w:sz w:val="28"/>
+          <w:szCs w:val="28"/>
+        </w:rPr>
+        <w:t xml:space="preserve">For managers you have access to view each of the employees in your </w:t>
+      </w:r>
+      <w:proofErr w:type="gramStart"/>
+      <w:r>
+        <w:rPr>
+          <w:sz w:val="28"/>
+          <w:szCs w:val="28"/>
+        </w:rPr>
+        <w:t>departments</w:t>
+      </w:r>
+      <w:proofErr w:type="gramEnd"/>
+      <w:r>
+        <w:rPr>
+          <w:sz w:val="28"/>
+          <w:szCs w:val="28"/>
+        </w:rPr>
+        <w:t xml:space="preserve"> </w:t>
+      </w:r>
+      <w:proofErr w:type="gramStart"/>
+      <w:r>
+        <w:rPr>
+          <w:sz w:val="28"/>
+          <w:szCs w:val="28"/>
+        </w:rPr>
+        <w:t>time cards</w:t>
+      </w:r>
+      <w:proofErr w:type="gramEnd"/>
+      <w:r>
+        <w:rPr>
+          <w:sz w:val="28"/>
+          <w:szCs w:val="28"/>
+        </w:rPr>
+        <w:t xml:space="preserve">. After and employee submits and </w:t>
+      </w:r>
+      <w:proofErr w:type="gramStart"/>
+      <w:r>
+        <w:rPr>
+          <w:sz w:val="28"/>
+          <w:szCs w:val="28"/>
+        </w:rPr>
+        <w:t>Acknowledges</w:t>
+      </w:r>
+      <w:proofErr w:type="gramEnd"/>
+      <w:r>
+        <w:rPr>
+          <w:sz w:val="28"/>
+          <w:szCs w:val="28"/>
+        </w:rPr>
+        <w:t xml:space="preserve"> their </w:t>
+      </w:r>
+      <w:proofErr w:type="gramStart"/>
+      <w:r>
+        <w:rPr>
+          <w:sz w:val="28"/>
+          <w:szCs w:val="28"/>
+        </w:rPr>
+        <w:t>time cards</w:t>
+      </w:r>
+      <w:proofErr w:type="gramEnd"/>
+      <w:r>
+        <w:rPr>
+          <w:sz w:val="28"/>
+          <w:szCs w:val="28"/>
+        </w:rPr>
+        <w:t xml:space="preserve"> you will then review the </w:t>
+      </w:r>
+      <w:proofErr w:type="gramStart"/>
+      <w:r>
+        <w:rPr>
+          <w:sz w:val="28"/>
+          <w:szCs w:val="28"/>
+        </w:rPr>
+        <w:t>time card</w:t>
+      </w:r>
+      <w:proofErr w:type="gramEnd"/>
+      <w:r>
+        <w:rPr>
+          <w:sz w:val="28"/>
+          <w:szCs w:val="28"/>
+        </w:rPr>
+        <w:t xml:space="preserve"> and Approve It by checking off the box next to </w:t>
+      </w:r>
+      <w:r>
+        <w:rPr>
+          <w:b/>
+          <w:bCs/>
+          <w:sz w:val="28"/>
+          <w:szCs w:val="28"/>
+        </w:rPr>
         <w:t>Manager Approval.</w:t>
       </w:r>
       <w:r>
@@ -1356,6 +2056,7 @@
       </w:pPr>
       <w:r>
         <w:rPr>
+          <w:noProof/>
           <w:sz w:val="28"/>
           <w:szCs w:val="28"/>
         </w:rPr>
@@ -1377,7 +2078,7 @@
                     </pic:cNvPicPr>
                   </pic:nvPicPr>
                   <pic:blipFill>
-                    <a:blip r:embed="rId14" cstate="print">
+                    <a:blip r:embed="rId20" cstate="print">
                       <a:extLst>
                         <a:ext uri="{28A0092B-C50C-407E-A947-70E740481C1C}">
                           <a14:useLocalDpi xmlns:a14="http://schemas.microsoft.com/office/drawing/2010/main" val="0"/>
@@ -1418,9 +2119,11 @@
       </w:pPr>
       <w:r>
         <w:rPr>
-          <w:sz w:val="28"/>
-          <w:szCs w:val="28"/>
-        </w:rPr>
+          <w:noProof/>
+          <w:sz w:val="28"/>
+          <w:szCs w:val="28"/>
+        </w:rPr>
+        <w:lastRenderedPageBreak/>
         <w:drawing>
           <wp:inline distT="0" distB="0" distL="0" distR="0" wp14:anchorId="7C683D7F" wp14:editId="089F445D">
             <wp:extent cx="5943600" cy="2642870"/>
@@ -1439,7 +2142,7 @@
                     </pic:cNvPicPr>
                   </pic:nvPicPr>
                   <pic:blipFill>
-                    <a:blip r:embed="rId15" cstate="print">
+                    <a:blip r:embed="rId21" cstate="print">
                       <a:extLst>
                         <a:ext uri="{28A0092B-C50C-407E-A947-70E740481C1C}">
                           <a14:useLocalDpi xmlns:a14="http://schemas.microsoft.com/office/drawing/2010/main" val="0"/>
@@ -1499,7 +2202,6 @@
           <w:sz w:val="28"/>
           <w:szCs w:val="28"/>
         </w:rPr>
-        <w:lastRenderedPageBreak/>
         <w:t xml:space="preserve">Part </w:t>
       </w:r>
       <w:r>
@@ -1582,6 +2284,7 @@
       </w:pPr>
       <w:r>
         <w:rPr>
+          <w:noProof/>
           <w:sz w:val="28"/>
           <w:szCs w:val="28"/>
         </w:rPr>
@@ -1603,7 +2306,7 @@
                     </pic:cNvPicPr>
                   </pic:nvPicPr>
                   <pic:blipFill>
-                    <a:blip r:embed="rId16" cstate="print">
+                    <a:blip r:embed="rId22" cstate="print">
                       <a:extLst>
                         <a:ext uri="{28A0092B-C50C-407E-A947-70E740481C1C}">
                           <a14:useLocalDpi xmlns:a14="http://schemas.microsoft.com/office/drawing/2010/main" val="0"/>
@@ -1644,7 +2347,7 @@
       </w:pPr>
     </w:p>
     <w:sectPr>
-      <w:headerReference w:type="default" r:id="rId17"/>
+      <w:headerReference w:type="default" r:id="rId23"/>
       <w:pgSz w:w="12240" w:h="15840"/>
       <w:pgMar w:top="1440" w:right="1440" w:bottom="1440" w:left="1440" w:header="576" w:footer="288" w:gutter="0"/>
       <w:cols w:space="720"/>
@@ -1763,6 +2466,126 @@
     </w:pPr>
   </w:p>
 </w:hdr>
+</file>
+
+<file path=word/numbering.xml><?xml version="1.0" encoding="utf-8"?>
+<w:numbering xmlns:wpc="http://schemas.microsoft.com/office/word/2010/wordprocessingCanvas" xmlns:cx="http://schemas.microsoft.com/office/drawing/2014/chartex" xmlns:cx1="http://schemas.microsoft.com/office/drawing/2015/9/8/chartex" xmlns:cx2="http://schemas.microsoft.com/office/drawing/2015/10/21/chartex" xmlns:cx3="http://schemas.microsoft.com/office/drawing/2016/5/9/chartex" xmlns:cx4="http://schemas.microsoft.com/office/drawing/2016/5/10/chartex" xmlns:cx5="http://schemas.microsoft.com/office/drawing/2016/5/11/chartex" xmlns:cx6="http://schemas.microsoft.com/office/drawing/2016/5/12/chartex" xmlns:cx7="http://schemas.microsoft.com/office/drawing/2016/5/13/chartex" xmlns:cx8="http://schemas.microsoft.com/office/drawing/2016/5/14/chartex" xmlns:mc="http://schemas.openxmlformats.org/markup-compatibility/2006" xmlns:aink="http://schemas.microsoft.com/office/drawing/2016/ink" xmlns:am3d="http://schemas.microsoft.com/office/drawing/2017/model3d" xmlns:o="urn:schemas-microsoft-com:office:office" xmlns:oel="http://schemas.microsoft.com/office/2019/extlst" xmlns:r="http://schemas.openxmlformats.org/officeDocument/2006/relationships" xmlns:m="http://schemas.openxmlformats.org/officeDocument/2006/math" xmlns:v="urn:schemas-microsoft-com:vml" xmlns:wp14="http://schemas.microsoft.com/office/word/2010/wordprocessingDrawing" xmlns:wp="http://schemas.openxmlformats.org/drawingml/2006/wordprocessingDrawing" xmlns:w10="urn:schemas-microsoft-com:office:word" xmlns:w="http://schemas.openxmlformats.org/wordprocessingml/2006/main" xmlns:w14="http://schemas.microsoft.com/office/word/2010/wordml" xmlns:w15="http://schemas.microsoft.com/office/word/2012/wordml" xmlns:w16cex="http://schemas.microsoft.com/office/word/2018/wordml/cex" xmlns:w16cid="http://schemas.microsoft.com/office/word/2016/wordml/cid" xmlns:w16="http://schemas.microsoft.com/office/word/2018/wordml" xmlns:w16du="http://schemas.microsoft.com/office/word/2023/wordml/word16du" xmlns:w16sdtdh="http://schemas.microsoft.com/office/word/2020/wordml/sdtdatahash" xmlns:w16sdtfl="http://schemas.microsoft.com/office/word/2024/wordml/sdtformatlock" xmlns:w16se="http://schemas.microsoft.com/office/word/2015/wordml/symex" xmlns:wpg="http://schemas.microsoft.com/office/word/2010/wordprocessingGroup" xmlns:wpi="http://schemas.microsoft.com/office/word/2010/wordprocessingInk" xmlns:wne="http://schemas.microsoft.com/office/word/2006/wordml" xmlns:wps="http://schemas.microsoft.com/office/word/2010/wordprocessingShape" mc:Ignorable="w14 w15 w16se w16cid w16 w16cex w16sdtdh w16sdtfl w16du wp14">
+  <w:abstractNum w:abstractNumId="0" w15:restartNumberingAfterBreak="0">
+    <w:nsid w:val="43931287"/>
+    <w:multiLevelType w:val="hybridMultilevel"/>
+    <w:tmpl w:val="6A7C8030"/>
+    <w:lvl w:ilvl="0" w:tplc="0A18A974">
+      <w:numFmt w:val="bullet"/>
+      <w:lvlText w:val="-"/>
+      <w:lvlJc w:val="left"/>
+      <w:pPr>
+        <w:ind w:left="720" w:hanging="360"/>
+      </w:pPr>
+      <w:rPr>
+        <w:rFonts w:ascii="Aptos" w:eastAsiaTheme="minorHAnsi" w:hAnsi="Aptos" w:cstheme="minorBidi" w:hint="default"/>
+      </w:rPr>
+    </w:lvl>
+    <w:lvl w:ilvl="1" w:tplc="04090003" w:tentative="1">
+      <w:start w:val="1"/>
+      <w:numFmt w:val="bullet"/>
+      <w:lvlText w:val="o"/>
+      <w:lvlJc w:val="left"/>
+      <w:pPr>
+        <w:ind w:left="1440" w:hanging="360"/>
+      </w:pPr>
+      <w:rPr>
+        <w:rFonts w:ascii="Courier New" w:hAnsi="Courier New" w:cs="Courier New" w:hint="default"/>
+      </w:rPr>
+    </w:lvl>
+    <w:lvl w:ilvl="2" w:tplc="04090005" w:tentative="1">
+      <w:start w:val="1"/>
+      <w:numFmt w:val="bullet"/>
+      <w:lvlText w:val=""/>
+      <w:lvlJc w:val="left"/>
+      <w:pPr>
+        <w:ind w:left="2160" w:hanging="360"/>
+      </w:pPr>
+      <w:rPr>
+        <w:rFonts w:ascii="Wingdings" w:hAnsi="Wingdings" w:hint="default"/>
+      </w:rPr>
+    </w:lvl>
+    <w:lvl w:ilvl="3" w:tplc="04090001" w:tentative="1">
+      <w:start w:val="1"/>
+      <w:numFmt w:val="bullet"/>
+      <w:lvlText w:val=""/>
+      <w:lvlJc w:val="left"/>
+      <w:pPr>
+        <w:ind w:left="2880" w:hanging="360"/>
+      </w:pPr>
+      <w:rPr>
+        <w:rFonts w:ascii="Symbol" w:hAnsi="Symbol" w:hint="default"/>
+      </w:rPr>
+    </w:lvl>
+    <w:lvl w:ilvl="4" w:tplc="04090003" w:tentative="1">
+      <w:start w:val="1"/>
+      <w:numFmt w:val="bullet"/>
+      <w:lvlText w:val="o"/>
+      <w:lvlJc w:val="left"/>
+      <w:pPr>
+        <w:ind w:left="3600" w:hanging="360"/>
+      </w:pPr>
+      <w:rPr>
+        <w:rFonts w:ascii="Courier New" w:hAnsi="Courier New" w:cs="Courier New" w:hint="default"/>
+      </w:rPr>
+    </w:lvl>
+    <w:lvl w:ilvl="5" w:tplc="04090005" w:tentative="1">
+      <w:start w:val="1"/>
+      <w:numFmt w:val="bullet"/>
+      <w:lvlText w:val=""/>
+      <w:lvlJc w:val="left"/>
+      <w:pPr>
+        <w:ind w:left="4320" w:hanging="360"/>
+      </w:pPr>
+      <w:rPr>
+        <w:rFonts w:ascii="Wingdings" w:hAnsi="Wingdings" w:hint="default"/>
+      </w:rPr>
+    </w:lvl>
+    <w:lvl w:ilvl="6" w:tplc="04090001" w:tentative="1">
+      <w:start w:val="1"/>
+      <w:numFmt w:val="bullet"/>
+      <w:lvlText w:val=""/>
+      <w:lvlJc w:val="left"/>
+      <w:pPr>
+        <w:ind w:left="5040" w:hanging="360"/>
+      </w:pPr>
+      <w:rPr>
+        <w:rFonts w:ascii="Symbol" w:hAnsi="Symbol" w:hint="default"/>
+      </w:rPr>
+    </w:lvl>
+    <w:lvl w:ilvl="7" w:tplc="04090003" w:tentative="1">
+      <w:start w:val="1"/>
+      <w:numFmt w:val="bullet"/>
+      <w:lvlText w:val="o"/>
+      <w:lvlJc w:val="left"/>
+      <w:pPr>
+        <w:ind w:left="5760" w:hanging="360"/>
+      </w:pPr>
+      <w:rPr>
+        <w:rFonts w:ascii="Courier New" w:hAnsi="Courier New" w:cs="Courier New" w:hint="default"/>
+      </w:rPr>
+    </w:lvl>
+    <w:lvl w:ilvl="8" w:tplc="04090005" w:tentative="1">
+      <w:start w:val="1"/>
+      <w:numFmt w:val="bullet"/>
+      <w:lvlText w:val=""/>
+      <w:lvlJc w:val="left"/>
+      <w:pPr>
+        <w:ind w:left="6480" w:hanging="360"/>
+      </w:pPr>
+      <w:rPr>
+        <w:rFonts w:ascii="Wingdings" w:hAnsi="Wingdings" w:hint="default"/>
+      </w:rPr>
+    </w:lvl>
+  </w:abstractNum>
+  <w:num w:numId="1" w16cid:durableId="1099912464">
+    <w:abstractNumId w:val="0"/>
+  </w:num>
+</w:numbering>
 </file>
 
 <file path=word/styles.xml><?xml version="1.0" encoding="utf-8"?>
@@ -2368,6 +3191,7 @@
   <w:style w:type="character" w:default="1" w:styleId="DefaultParagraphFont">
     <w:name w:val="Default Paragraph Font"/>
     <w:uiPriority w:val="1"/>
+    <w:semiHidden/>
     <w:unhideWhenUsed/>
   </w:style>
   <w:style w:type="table" w:default="1" w:styleId="TableNormal">

</xml_diff>